<commit_message>
Fix: linter issues, remade README, configs
</commit_message>
<xml_diff>
--- a/reports/Инструктаж_аналитика.docx
+++ b/reports/Инструктаж_аналитика.docx
@@ -34,7 +34,7 @@
         <w:spacing w:after="120" w:line="276" w:lineRule="auto"/>
       </w:pPr>
       <w:r>
-        <w:t>Конкурс СберИндекса, трек «Кластеризация». Выборка по умолчанию — все муниципалитеты России (федеральные округа, в том числе ДФО, — пресеты), 2013–2024 гг.; денежные показатели — в ценах базового года (по умолчанию 2023 г.).</w:t>
+        <w:t>Конкурс СберИндекса, трек «Кластеризация». Выборка по умолчанию — все муниципалитеты России (федеральные округа, в том числе ДФО, — пресеты), без МО, менявших границы, 2014–2024 гг.; денежные показатели — в ценах базового года (по умолчанию 2020 г., как в отчёте).</w:t>
       </w:r>
     </w:p>
     <w:p>
@@ -188,7 +188,7 @@
     <w:sdt>
       <w:sdtPr>
         <w:alias w:val="Содержание"/>
-        <w:id w:val="-1187896226"/>
+        <w:id w:val="442124201"/>
       </w:sdtPr>
       <w:sdtEndPr/>
       <w:sdtContent>
@@ -216,7 +216,7 @@
           <w:r>
             <w:fldChar w:fldCharType="separate"/>
           </w:r>
-          <w:hyperlink w:anchor="_Toc242217127" w:history="1">
+          <w:hyperlink w:anchor="_Toc242443270" w:history="1">
             <w:r>
               <w:rPr>
                 <w:rStyle w:val="a5"/>
@@ -240,7 +240,7 @@
               <w:rPr>
                 <w:noProof/>
               </w:rPr>
-              <w:instrText xml:space="preserve"> PAGEREF _Toc242217127 \h </w:instrText>
+              <w:instrText xml:space="preserve"> PAGEREF _Toc242443270 \h </w:instrText>
             </w:r>
             <w:r>
               <w:rPr>
@@ -282,7 +282,7 @@
               <w14:ligatures w14:val="standardContextual"/>
             </w:rPr>
           </w:pPr>
-          <w:hyperlink w:anchor="_Toc242217128" w:history="1">
+          <w:hyperlink w:anchor="_Toc242443271" w:history="1">
             <w:r>
               <w:rPr>
                 <w:rStyle w:val="a5"/>
@@ -306,7 +306,7 @@
               <w:rPr>
                 <w:noProof/>
               </w:rPr>
-              <w:instrText xml:space="preserve"> PAGEREF _Toc242217128 \h </w:instrText>
+              <w:instrText xml:space="preserve"> PAGEREF _Toc242443271 \h </w:instrText>
             </w:r>
             <w:r>
               <w:rPr>
@@ -348,7 +348,7 @@
               <w14:ligatures w14:val="standardContextual"/>
             </w:rPr>
           </w:pPr>
-          <w:hyperlink w:anchor="_Toc242217129" w:history="1">
+          <w:hyperlink w:anchor="_Toc242443272" w:history="1">
             <w:r>
               <w:rPr>
                 <w:rStyle w:val="a5"/>
@@ -372,7 +372,7 @@
               <w:rPr>
                 <w:noProof/>
               </w:rPr>
-              <w:instrText xml:space="preserve"> PAGEREF _Toc242217129 \h </w:instrText>
+              <w:instrText xml:space="preserve"> PAGEREF _Toc242443272 \h </w:instrText>
             </w:r>
             <w:r>
               <w:rPr>
@@ -414,7 +414,7 @@
               <w14:ligatures w14:val="standardContextual"/>
             </w:rPr>
           </w:pPr>
-          <w:hyperlink w:anchor="_Toc242217130" w:history="1">
+          <w:hyperlink w:anchor="_Toc242443273" w:history="1">
             <w:r>
               <w:rPr>
                 <w:rStyle w:val="a5"/>
@@ -438,7 +438,7 @@
               <w:rPr>
                 <w:noProof/>
               </w:rPr>
-              <w:instrText xml:space="preserve"> PAGEREF _Toc242217130 \h </w:instrText>
+              <w:instrText xml:space="preserve"> PAGEREF _Toc242443273 \h </w:instrText>
             </w:r>
             <w:r>
               <w:rPr>
@@ -480,7 +480,7 @@
               <w14:ligatures w14:val="standardContextual"/>
             </w:rPr>
           </w:pPr>
-          <w:hyperlink w:anchor="_Toc242217131" w:history="1">
+          <w:hyperlink w:anchor="_Toc242443274" w:history="1">
             <w:r>
               <w:rPr>
                 <w:rStyle w:val="a5"/>
@@ -504,7 +504,7 @@
               <w:rPr>
                 <w:noProof/>
               </w:rPr>
-              <w:instrText xml:space="preserve"> PAGEREF _Toc242217131 \h </w:instrText>
+              <w:instrText xml:space="preserve"> PAGEREF _Toc242443274 \h </w:instrText>
             </w:r>
             <w:r>
               <w:rPr>
@@ -546,7 +546,7 @@
               <w14:ligatures w14:val="standardContextual"/>
             </w:rPr>
           </w:pPr>
-          <w:hyperlink w:anchor="_Toc242217132" w:history="1">
+          <w:hyperlink w:anchor="_Toc242443275" w:history="1">
             <w:r>
               <w:rPr>
                 <w:rStyle w:val="a5"/>
@@ -570,7 +570,7 @@
               <w:rPr>
                 <w:noProof/>
               </w:rPr>
-              <w:instrText xml:space="preserve"> PAGEREF _Toc242217132 \h </w:instrText>
+              <w:instrText xml:space="preserve"> PAGEREF _Toc242443275 \h </w:instrText>
             </w:r>
             <w:r>
               <w:rPr>
@@ -587,7 +587,7 @@
               <w:rPr>
                 <w:noProof/>
               </w:rPr>
-              <w:t>5</w:t>
+              <w:t>6</w:t>
             </w:r>
             <w:r>
               <w:rPr>
@@ -612,7 +612,7 @@
               <w14:ligatures w14:val="standardContextual"/>
             </w:rPr>
           </w:pPr>
-          <w:hyperlink w:anchor="_Toc242217133" w:history="1">
+          <w:hyperlink w:anchor="_Toc242443276" w:history="1">
             <w:r>
               <w:rPr>
                 <w:rStyle w:val="a5"/>
@@ -636,7 +636,7 @@
               <w:rPr>
                 <w:noProof/>
               </w:rPr>
-              <w:instrText xml:space="preserve"> PAGEREF _Toc242217133 \h </w:instrText>
+              <w:instrText xml:space="preserve"> PAGEREF _Toc242443276 \h </w:instrText>
             </w:r>
             <w:r>
               <w:rPr>
@@ -678,7 +678,7 @@
               <w14:ligatures w14:val="standardContextual"/>
             </w:rPr>
           </w:pPr>
-          <w:hyperlink w:anchor="_Toc242217134" w:history="1">
+          <w:hyperlink w:anchor="_Toc242443277" w:history="1">
             <w:r>
               <w:rPr>
                 <w:rStyle w:val="a5"/>
@@ -702,7 +702,7 @@
               <w:rPr>
                 <w:noProof/>
               </w:rPr>
-              <w:instrText xml:space="preserve"> PAGEREF _Toc242217134 \h </w:instrText>
+              <w:instrText xml:space="preserve"> PAGEREF _Toc242443277 \h </w:instrText>
             </w:r>
             <w:r>
               <w:rPr>
@@ -744,7 +744,7 @@
               <w14:ligatures w14:val="standardContextual"/>
             </w:rPr>
           </w:pPr>
-          <w:hyperlink w:anchor="_Toc242217135" w:history="1">
+          <w:hyperlink w:anchor="_Toc242443278" w:history="1">
             <w:r>
               <w:rPr>
                 <w:rStyle w:val="a5"/>
@@ -768,7 +768,7 @@
               <w:rPr>
                 <w:noProof/>
               </w:rPr>
-              <w:instrText xml:space="preserve"> PAGEREF _Toc242217135 \h </w:instrText>
+              <w:instrText xml:space="preserve"> PAGEREF _Toc242443278 \h </w:instrText>
             </w:r>
             <w:r>
               <w:rPr>
@@ -810,7 +810,7 @@
               <w14:ligatures w14:val="standardContextual"/>
             </w:rPr>
           </w:pPr>
-          <w:hyperlink w:anchor="_Toc242217136" w:history="1">
+          <w:hyperlink w:anchor="_Toc242443279" w:history="1">
             <w:r>
               <w:rPr>
                 <w:rStyle w:val="a5"/>
@@ -834,7 +834,7 @@
               <w:rPr>
                 <w:noProof/>
               </w:rPr>
-              <w:instrText xml:space="preserve"> PAGEREF _Toc242217136 \h </w:instrText>
+              <w:instrText xml:space="preserve"> PAGEREF _Toc242443279 \h </w:instrText>
             </w:r>
             <w:r>
               <w:rPr>
@@ -876,7 +876,7 @@
               <w14:ligatures w14:val="standardContextual"/>
             </w:rPr>
           </w:pPr>
-          <w:hyperlink w:anchor="_Toc242217137" w:history="1">
+          <w:hyperlink w:anchor="_Toc242443280" w:history="1">
             <w:r>
               <w:rPr>
                 <w:rStyle w:val="a5"/>
@@ -900,7 +900,7 @@
               <w:rPr>
                 <w:noProof/>
               </w:rPr>
-              <w:instrText xml:space="preserve"> PAGEREF _Toc242217137 \h </w:instrText>
+              <w:instrText xml:space="preserve"> PAGEREF _Toc242443280 \h </w:instrText>
             </w:r>
             <w:r>
               <w:rPr>
@@ -942,7 +942,7 @@
               <w14:ligatures w14:val="standardContextual"/>
             </w:rPr>
           </w:pPr>
-          <w:hyperlink w:anchor="_Toc242217138" w:history="1">
+          <w:hyperlink w:anchor="_Toc242443281" w:history="1">
             <w:r>
               <w:rPr>
                 <w:rStyle w:val="a5"/>
@@ -966,7 +966,7 @@
               <w:rPr>
                 <w:noProof/>
               </w:rPr>
-              <w:instrText xml:space="preserve"> PAGEREF _Toc242217138 \h </w:instrText>
+              <w:instrText xml:space="preserve"> PAGEREF _Toc242443281 \h </w:instrText>
             </w:r>
             <w:r>
               <w:rPr>
@@ -1008,7 +1008,7 @@
               <w14:ligatures w14:val="standardContextual"/>
             </w:rPr>
           </w:pPr>
-          <w:hyperlink w:anchor="_Toc242217139" w:history="1">
+          <w:hyperlink w:anchor="_Toc242443282" w:history="1">
             <w:r>
               <w:rPr>
                 <w:rStyle w:val="a5"/>
@@ -1032,7 +1032,7 @@
               <w:rPr>
                 <w:noProof/>
               </w:rPr>
-              <w:instrText xml:space="preserve"> PAGEREF _Toc242217139 \h </w:instrText>
+              <w:instrText xml:space="preserve"> PAGEREF _Toc242443282 \h </w:instrText>
             </w:r>
             <w:r>
               <w:rPr>
@@ -1074,7 +1074,7 @@
               <w14:ligatures w14:val="standardContextual"/>
             </w:rPr>
           </w:pPr>
-          <w:hyperlink w:anchor="_Toc242217140" w:history="1">
+          <w:hyperlink w:anchor="_Toc242443283" w:history="1">
             <w:r>
               <w:rPr>
                 <w:rStyle w:val="a5"/>
@@ -1098,7 +1098,7 @@
               <w:rPr>
                 <w:noProof/>
               </w:rPr>
-              <w:instrText xml:space="preserve"> PAGEREF _Toc242217140 \h </w:instrText>
+              <w:instrText xml:space="preserve"> PAGEREF _Toc242443283 \h </w:instrText>
             </w:r>
             <w:r>
               <w:rPr>
@@ -1140,7 +1140,7 @@
               <w14:ligatures w14:val="standardContextual"/>
             </w:rPr>
           </w:pPr>
-          <w:hyperlink w:anchor="_Toc242217141" w:history="1">
+          <w:hyperlink w:anchor="_Toc242443284" w:history="1">
             <w:r>
               <w:rPr>
                 <w:rStyle w:val="a5"/>
@@ -1164,7 +1164,7 @@
               <w:rPr>
                 <w:noProof/>
               </w:rPr>
-              <w:instrText xml:space="preserve"> PAGEREF _Toc242217141 \h </w:instrText>
+              <w:instrText xml:space="preserve"> PAGEREF _Toc242443284 \h </w:instrText>
             </w:r>
             <w:r>
               <w:rPr>
@@ -1206,7 +1206,7 @@
               <w14:ligatures w14:val="standardContextual"/>
             </w:rPr>
           </w:pPr>
-          <w:hyperlink w:anchor="_Toc242217142" w:history="1">
+          <w:hyperlink w:anchor="_Toc242443285" w:history="1">
             <w:r>
               <w:rPr>
                 <w:rStyle w:val="a5"/>
@@ -1230,7 +1230,7 @@
               <w:rPr>
                 <w:noProof/>
               </w:rPr>
-              <w:instrText xml:space="preserve"> PAGEREF _Toc242217142 \h </w:instrText>
+              <w:instrText xml:space="preserve"> PAGEREF _Toc242443285 \h </w:instrText>
             </w:r>
             <w:r>
               <w:rPr>
@@ -1272,7 +1272,7 @@
               <w14:ligatures w14:val="standardContextual"/>
             </w:rPr>
           </w:pPr>
-          <w:hyperlink w:anchor="_Toc242217143" w:history="1">
+          <w:hyperlink w:anchor="_Toc242443286" w:history="1">
             <w:r>
               <w:rPr>
                 <w:rStyle w:val="a5"/>
@@ -1296,7 +1296,7 @@
               <w:rPr>
                 <w:noProof/>
               </w:rPr>
-              <w:instrText xml:space="preserve"> PAGEREF _Toc242217143 \h </w:instrText>
+              <w:instrText xml:space="preserve"> PAGEREF _Toc242443286 \h </w:instrText>
             </w:r>
             <w:r>
               <w:rPr>
@@ -1338,7 +1338,7 @@
               <w14:ligatures w14:val="standardContextual"/>
             </w:rPr>
           </w:pPr>
-          <w:hyperlink w:anchor="_Toc242217144" w:history="1">
+          <w:hyperlink w:anchor="_Toc242443287" w:history="1">
             <w:r>
               <w:rPr>
                 <w:rStyle w:val="a5"/>
@@ -1362,7 +1362,7 @@
               <w:rPr>
                 <w:noProof/>
               </w:rPr>
-              <w:instrText xml:space="preserve"> PAGEREF _Toc242217144 \h </w:instrText>
+              <w:instrText xml:space="preserve"> PAGEREF _Toc242443287 \h </w:instrText>
             </w:r>
             <w:r>
               <w:rPr>
@@ -1404,7 +1404,7 @@
               <w14:ligatures w14:val="standardContextual"/>
             </w:rPr>
           </w:pPr>
-          <w:hyperlink w:anchor="_Toc242217145" w:history="1">
+          <w:hyperlink w:anchor="_Toc242443288" w:history="1">
             <w:r>
               <w:rPr>
                 <w:rStyle w:val="a5"/>
@@ -1428,7 +1428,7 @@
               <w:rPr>
                 <w:noProof/>
               </w:rPr>
-              <w:instrText xml:space="preserve"> PAGEREF _Toc242217145 \h </w:instrText>
+              <w:instrText xml:space="preserve"> PAGEREF _Toc242443288 \h </w:instrText>
             </w:r>
             <w:r>
               <w:rPr>
@@ -1470,7 +1470,7 @@
               <w14:ligatures w14:val="standardContextual"/>
             </w:rPr>
           </w:pPr>
-          <w:hyperlink w:anchor="_Toc242217146" w:history="1">
+          <w:hyperlink w:anchor="_Toc242443289" w:history="1">
             <w:r>
               <w:rPr>
                 <w:rStyle w:val="a5"/>
@@ -1494,7 +1494,7 @@
               <w:rPr>
                 <w:noProof/>
               </w:rPr>
-              <w:instrText xml:space="preserve"> PAGEREF _Toc242217146 \h </w:instrText>
+              <w:instrText xml:space="preserve"> PAGEREF _Toc242443289 \h </w:instrText>
             </w:r>
             <w:r>
               <w:rPr>
@@ -1536,7 +1536,7 @@
               <w14:ligatures w14:val="standardContextual"/>
             </w:rPr>
           </w:pPr>
-          <w:hyperlink w:anchor="_Toc242217147" w:history="1">
+          <w:hyperlink w:anchor="_Toc242443290" w:history="1">
             <w:r>
               <w:rPr>
                 <w:rStyle w:val="a5"/>
@@ -1560,7 +1560,7 @@
               <w:rPr>
                 <w:noProof/>
               </w:rPr>
-              <w:instrText xml:space="preserve"> PAGEREF _Toc242217147 \h </w:instrText>
+              <w:instrText xml:space="preserve"> PAGEREF _Toc242443290 \h </w:instrText>
             </w:r>
             <w:r>
               <w:rPr>
@@ -1602,7 +1602,7 @@
               <w14:ligatures w14:val="standardContextual"/>
             </w:rPr>
           </w:pPr>
-          <w:hyperlink w:anchor="_Toc242217148" w:history="1">
+          <w:hyperlink w:anchor="_Toc242443291" w:history="1">
             <w:r>
               <w:rPr>
                 <w:rStyle w:val="a5"/>
@@ -1626,7 +1626,7 @@
               <w:rPr>
                 <w:noProof/>
               </w:rPr>
-              <w:instrText xml:space="preserve"> PAGEREF _Toc242217148 \h </w:instrText>
+              <w:instrText xml:space="preserve"> PAGEREF _Toc242443291 \h </w:instrText>
             </w:r>
             <w:r>
               <w:rPr>
@@ -1668,7 +1668,7 @@
               <w14:ligatures w14:val="standardContextual"/>
             </w:rPr>
           </w:pPr>
-          <w:hyperlink w:anchor="_Toc242217149" w:history="1">
+          <w:hyperlink w:anchor="_Toc242443292" w:history="1">
             <w:r>
               <w:rPr>
                 <w:rStyle w:val="a5"/>
@@ -1692,7 +1692,7 @@
               <w:rPr>
                 <w:noProof/>
               </w:rPr>
-              <w:instrText xml:space="preserve"> PAGEREF _Toc242217149 \h </w:instrText>
+              <w:instrText xml:space="preserve"> PAGEREF _Toc242443292 \h </w:instrText>
             </w:r>
             <w:r>
               <w:rPr>
@@ -1734,7 +1734,7 @@
               <w14:ligatures w14:val="standardContextual"/>
             </w:rPr>
           </w:pPr>
-          <w:hyperlink w:anchor="_Toc242217150" w:history="1">
+          <w:hyperlink w:anchor="_Toc242443293" w:history="1">
             <w:r>
               <w:rPr>
                 <w:rStyle w:val="a5"/>
@@ -1758,7 +1758,7 @@
               <w:rPr>
                 <w:noProof/>
               </w:rPr>
-              <w:instrText xml:space="preserve"> PAGEREF _Toc242217150 \h </w:instrText>
+              <w:instrText xml:space="preserve"> PAGEREF _Toc242443293 \h </w:instrText>
             </w:r>
             <w:r>
               <w:rPr>
@@ -1800,7 +1800,7 @@
               <w14:ligatures w14:val="standardContextual"/>
             </w:rPr>
           </w:pPr>
-          <w:hyperlink w:anchor="_Toc242217151" w:history="1">
+          <w:hyperlink w:anchor="_Toc242443294" w:history="1">
             <w:r>
               <w:rPr>
                 <w:rStyle w:val="a5"/>
@@ -1824,7 +1824,7 @@
               <w:rPr>
                 <w:noProof/>
               </w:rPr>
-              <w:instrText xml:space="preserve"> PAGEREF _Toc242217151 \h </w:instrText>
+              <w:instrText xml:space="preserve"> PAGEREF _Toc242443294 \h </w:instrText>
             </w:r>
             <w:r>
               <w:rPr>
@@ -1841,7 +1841,7 @@
               <w:rPr>
                 <w:noProof/>
               </w:rPr>
-              <w:t>11</w:t>
+              <w:t>12</w:t>
             </w:r>
             <w:r>
               <w:rPr>
@@ -1866,7 +1866,7 @@
               <w14:ligatures w14:val="standardContextual"/>
             </w:rPr>
           </w:pPr>
-          <w:hyperlink w:anchor="_Toc242217152" w:history="1">
+          <w:hyperlink w:anchor="_Toc242443295" w:history="1">
             <w:r>
               <w:rPr>
                 <w:rStyle w:val="a5"/>
@@ -1890,7 +1890,7 @@
               <w:rPr>
                 <w:noProof/>
               </w:rPr>
-              <w:instrText xml:space="preserve"> PAGEREF _Toc242217152 \h </w:instrText>
+              <w:instrText xml:space="preserve"> PAGEREF _Toc242443295 \h </w:instrText>
             </w:r>
             <w:r>
               <w:rPr>
@@ -1932,7 +1932,7 @@
               <w14:ligatures w14:val="standardContextual"/>
             </w:rPr>
           </w:pPr>
-          <w:hyperlink w:anchor="_Toc242217153" w:history="1">
+          <w:hyperlink w:anchor="_Toc242443296" w:history="1">
             <w:r>
               <w:rPr>
                 <w:rStyle w:val="a5"/>
@@ -1956,7 +1956,7 @@
               <w:rPr>
                 <w:noProof/>
               </w:rPr>
-              <w:instrText xml:space="preserve"> PAGEREF _Toc242217153 \h </w:instrText>
+              <w:instrText xml:space="preserve"> PAGEREF _Toc242443296 \h </w:instrText>
             </w:r>
             <w:r>
               <w:rPr>
@@ -1998,7 +1998,7 @@
               <w14:ligatures w14:val="standardContextual"/>
             </w:rPr>
           </w:pPr>
-          <w:hyperlink w:anchor="_Toc242217154" w:history="1">
+          <w:hyperlink w:anchor="_Toc242443297" w:history="1">
             <w:r>
               <w:rPr>
                 <w:rStyle w:val="a5"/>
@@ -2022,7 +2022,7 @@
               <w:rPr>
                 <w:noProof/>
               </w:rPr>
-              <w:instrText xml:space="preserve"> PAGEREF _Toc242217154 \h </w:instrText>
+              <w:instrText xml:space="preserve"> PAGEREF _Toc242443297 \h </w:instrText>
             </w:r>
             <w:r>
               <w:rPr>
@@ -2064,7 +2064,7 @@
               <w14:ligatures w14:val="standardContextual"/>
             </w:rPr>
           </w:pPr>
-          <w:hyperlink w:anchor="_Toc242217155" w:history="1">
+          <w:hyperlink w:anchor="_Toc242443298" w:history="1">
             <w:r>
               <w:rPr>
                 <w:rStyle w:val="a5"/>
@@ -2088,7 +2088,7 @@
               <w:rPr>
                 <w:noProof/>
               </w:rPr>
-              <w:instrText xml:space="preserve"> PAGEREF _Toc242217155 \h </w:instrText>
+              <w:instrText xml:space="preserve"> PAGEREF _Toc242443298 \h </w:instrText>
             </w:r>
             <w:r>
               <w:rPr>
@@ -2130,7 +2130,7 @@
               <w14:ligatures w14:val="standardContextual"/>
             </w:rPr>
           </w:pPr>
-          <w:hyperlink w:anchor="_Toc242217156" w:history="1">
+          <w:hyperlink w:anchor="_Toc242443299" w:history="1">
             <w:r>
               <w:rPr>
                 <w:rStyle w:val="a5"/>
@@ -2154,7 +2154,7 @@
               <w:rPr>
                 <w:noProof/>
               </w:rPr>
-              <w:instrText xml:space="preserve"> PAGEREF _Toc242217156 \h </w:instrText>
+              <w:instrText xml:space="preserve"> PAGEREF _Toc242443299 \h </w:instrText>
             </w:r>
             <w:r>
               <w:rPr>
@@ -2196,7 +2196,7 @@
               <w14:ligatures w14:val="standardContextual"/>
             </w:rPr>
           </w:pPr>
-          <w:hyperlink w:anchor="_Toc242217157" w:history="1">
+          <w:hyperlink w:anchor="_Toc242443300" w:history="1">
             <w:r>
               <w:rPr>
                 <w:rStyle w:val="a5"/>
@@ -2220,7 +2220,7 @@
               <w:rPr>
                 <w:noProof/>
               </w:rPr>
-              <w:instrText xml:space="preserve"> PAGEREF _Toc242217157 \h </w:instrText>
+              <w:instrText xml:space="preserve"> PAGEREF _Toc242443300 \h </w:instrText>
             </w:r>
             <w:r>
               <w:rPr>
@@ -2265,7 +2265,7 @@
         <w:keepNext/>
         <w:spacing w:before="360"/>
       </w:pPr>
-      <w:bookmarkStart w:id="0" w:name="_Toc242217127"/>
+      <w:bookmarkStart w:id="0" w:name="_Toc242443270"/>
       <w:r>
         <w:lastRenderedPageBreak/>
         <w:t>1. Что это за инструмент и что он умеет</w:t>
@@ -2462,7 +2462,7 @@
         <w:keepNext/>
         <w:spacing w:before="360"/>
       </w:pPr>
-      <w:bookmarkStart w:id="1" w:name="_Toc242217128"/>
+      <w:bookmarkStart w:id="1" w:name="_Toc242443271"/>
       <w:r>
         <w:t>2. Рекомендуемый порядок работы</w:t>
       </w:r>
@@ -3327,7 +3327,7 @@
         <w:keepNext/>
         <w:spacing w:before="360"/>
       </w:pPr>
-      <w:bookmarkStart w:id="2" w:name="_Toc242217129"/>
+      <w:bookmarkStart w:id="2" w:name="_Toc242443272"/>
       <w:r>
         <w:t>3. Боковая панель: общие настройки</w:t>
       </w:r>
@@ -3601,7 +3601,7 @@
               <w:spacing w:after="40" w:line="252" w:lineRule="auto"/>
             </w:pPr>
             <w:r>
-              <w:t>Это фильтр показа: модель и нормировка всегда строятся на всей панели 2014–2024, поэтому кластеры конкретного года не меняются при сужении или расширении окна. Специализация занятости по МО есть только с 2017 г.: в 2014–2016 гг. МО относятся к кластерам по остальным признакам</w:t>
+              <w:t>Это фильтр показа: модель и нормировка всегда строятся на всей панели 2014–2024, поэтому кластеры конкретного года не меняются при сужении или расширении окна. Если выбран признак, которого нет в части лет (например, специализация занятости — только с 2017 г.), в эти годы МО относятся к кластерам по остальным признакам</w:t>
             </w:r>
           </w:p>
         </w:tc>
@@ -3776,6 +3776,7 @@
               <w:spacing w:after="40" w:line="252" w:lineRule="auto"/>
             </w:pPr>
             <w:r>
+              <w:lastRenderedPageBreak/>
               <w:t>Область нормировки</w:t>
             </w:r>
           </w:p>
@@ -3847,7 +3848,6 @@
               <w:spacing w:after="40" w:line="252" w:lineRule="auto"/>
             </w:pPr>
             <w:r>
-              <w:lastRenderedPageBreak/>
               <w:t>Денежные показатели</w:t>
             </w:r>
           </w:p>
@@ -3938,7 +3938,7 @@
               <w:spacing w:after="40" w:line="252" w:lineRule="auto"/>
             </w:pPr>
             <w:r>
-              <w:t>В ценах какого года показаны рубли (по умолчанию 2023)</w:t>
+              <w:t>В ценах какого года показаны рубли (по умолчанию 2020)</w:t>
             </w:r>
           </w:p>
         </w:tc>
@@ -4099,7 +4099,7 @@
               <w:spacing w:after="40" w:line="252" w:lineRule="auto"/>
             </w:pPr>
             <w:r>
-              <w:t>Чтобы сравнивать покупательную способность: 50 тыс. руб. на Чукотке и в Пензе — не одно и то же. По умолчанию выключена</w:t>
+              <w:t>Чтобы сравнивать покупательную способность: 50 тыс. руб. на Чукотке и в Пензе — не одно и то же. По умолчанию включена (как в отчёте)</w:t>
             </w:r>
           </w:p>
         </w:tc>
@@ -4149,7 +4149,7 @@
               <w:spacing w:after="60" w:line="264" w:lineRule="auto"/>
             </w:pPr>
             <w:r>
-              <w:t>Денежные показатели пересчитываются своими индексами цен: зарплата, ФОТ, бюджет, розница — ИПЦ; ВМП — дефлятором ВРП; инвестиции — индексом цен инвестиционной продукции; отгрузка — индексами цен производителей; продукция сельского хозяйства — индексом цен сельхозпроизводителей. Подписи в интерфейсе — «руб., в ценах 2023 г.»; откуда взят каждый индекс — внизу страницы «Данные и качество».</w:t>
+              <w:t>Денежные показатели пересчитываются своими индексами цен: зарплата, ФОТ, бюджет, розница — ИПЦ; ВМП — дефлятором ВРП; инвестиции — индексом цен инвестиционной продукции; отгрузка — индексами цен производителей; продукция сельского хозяйства — индексом цен сельхозпроизводителей. Подписи в интерфейсе — «руб., в ценах 2020 г.»; откуда взят каждый индекс — внизу страницы «Данные и качество».</w:t>
             </w:r>
           </w:p>
         </w:tc>
@@ -4161,7 +4161,7 @@
         <w:keepNext/>
         <w:spacing w:before="360"/>
       </w:pPr>
-      <w:bookmarkStart w:id="3" w:name="_Toc242217130"/>
+      <w:bookmarkStart w:id="3" w:name="_Toc242443273"/>
       <w:r>
         <w:t>4. Страница «Данные и качество»</w:t>
       </w:r>
@@ -4172,7 +4172,7 @@
         <w:pStyle w:val="2"/>
         <w:keepNext/>
       </w:pPr>
-      <w:bookmarkStart w:id="4" w:name="_Toc242217131"/>
+      <w:bookmarkStart w:id="4" w:name="_Toc242443274"/>
       <w:r>
         <w:t>На что смотреть</w:t>
       </w:r>
@@ -4313,8 +4313,9 @@
         <w:pStyle w:val="2"/>
         <w:keepNext/>
       </w:pPr>
-      <w:bookmarkStart w:id="5" w:name="_Toc242217132"/>
-      <w:r>
+      <w:bookmarkStart w:id="5" w:name="_Toc242443275"/>
+      <w:r>
+        <w:lastRenderedPageBreak/>
         <w:t>Как читать и что анализировать</w:t>
       </w:r>
       <w:bookmarkEnd w:id="5"/>
@@ -4355,7 +4356,6 @@
         <w:spacing w:after="60" w:line="264" w:lineRule="auto"/>
       </w:pPr>
       <w:r>
-        <w:lastRenderedPageBreak/>
         <w:t xml:space="preserve">Пропуск — это </w:t>
       </w:r>
       <w:r>
@@ -4475,7 +4475,7 @@
         <w:keepNext/>
         <w:spacing w:before="360"/>
       </w:pPr>
-      <w:bookmarkStart w:id="6" w:name="_Toc242217133"/>
+      <w:bookmarkStart w:id="6" w:name="_Toc242443276"/>
       <w:r>
         <w:t>5. Страница «Показатели»</w:t>
       </w:r>
@@ -4486,7 +4486,7 @@
         <w:pStyle w:val="2"/>
         <w:keepNext/>
       </w:pPr>
-      <w:bookmarkStart w:id="7" w:name="_Toc242217134"/>
+      <w:bookmarkStart w:id="7" w:name="_Toc242443277"/>
       <w:r>
         <w:t>На что смотреть</w:t>
       </w:r>
@@ -4597,7 +4597,7 @@
         <w:pStyle w:val="2"/>
         <w:keepNext/>
       </w:pPr>
-      <w:bookmarkStart w:id="8" w:name="_Toc242217135"/>
+      <w:bookmarkStart w:id="8" w:name="_Toc242443278"/>
       <w:r>
         <w:t>Что анализировать</w:t>
       </w:r>
@@ -4689,6 +4689,7 @@
         <w:keepNext/>
       </w:pPr>
       <w:r>
+        <w:lastRenderedPageBreak/>
         <w:t>Какую информацию можно получить</w:t>
       </w:r>
     </w:p>
@@ -4728,7 +4729,6 @@
         <w:spacing w:after="60" w:line="264" w:lineRule="auto"/>
       </w:pPr>
       <w:r>
-        <w:lastRenderedPageBreak/>
         <w:t>Насколько ВМП — расчётная оценка — согласуется с наблюдаемыми показателями (зарплата, отгрузка).</w:t>
       </w:r>
     </w:p>
@@ -4738,7 +4738,7 @@
         <w:keepNext/>
         <w:spacing w:before="360"/>
       </w:pPr>
-      <w:bookmarkStart w:id="9" w:name="_Toc242217136"/>
+      <w:bookmarkStart w:id="9" w:name="_Toc242443279"/>
       <w:r>
         <w:t>6. Страница «Сеть»</w:t>
       </w:r>
@@ -4767,7 +4767,7 @@
         <w:pStyle w:val="2"/>
         <w:keepNext/>
       </w:pPr>
-      <w:bookmarkStart w:id="10" w:name="_Toc242217137"/>
+      <w:bookmarkStart w:id="10" w:name="_Toc242443280"/>
       <w:r>
         <w:t>Параметры и их смысл</w:t>
       </w:r>
@@ -4944,7 +4944,7 @@
               <w:spacing w:after="40" w:line="252" w:lineRule="auto"/>
             </w:pPr>
             <w:r>
-              <w:t>4–7 слабо связанных показателей. Вес 2 — показатель вдвое важнее. По умолчанию: ВМП на душу, инвестиции без бюджета (оба — в ценах базового года), специализация (Херфиндаль), плотность, темп изменения населения</w:t>
+              <w:t>4–7 слабо связанных показателей. Вес 2 — показатель вдвое важнее. По умолчанию — набор из отчёта: ВМП на душу, среднемесячная зарплата, инвестиции без бюджета, отгрузка на жителя (все — в ценах базового года), бюджетная самостоятельность; расстояние евклидово</w:t>
             </w:r>
           </w:p>
         </w:tc>
@@ -5284,7 +5284,7 @@
               <w:spacing w:after="40" w:line="252" w:lineRule="auto"/>
             </w:pPr>
             <w:r>
-              <w:t>kNN + остовное дерево, k = 7: сеть связная, без изолированных узлов. Меньше k — более «рыхлые» сообщества</w:t>
+              <w:t>kNN + остовное дерево, k = 5: сеть связная, без изолированных узлов. Меньше k — более «рыхлые» сообщества</w:t>
             </w:r>
           </w:p>
         </w:tc>
@@ -5295,7 +5295,7 @@
         <w:pStyle w:val="2"/>
         <w:keepNext/>
       </w:pPr>
-      <w:bookmarkStart w:id="11" w:name="_Toc242217138"/>
+      <w:bookmarkStart w:id="11" w:name="_Toc242443281"/>
       <w:r>
         <w:t>На что смотреть</w:t>
       </w:r>
@@ -5355,6 +5355,7 @@
           <w:b/>
           <w:bCs/>
         </w:rPr>
+        <w:lastRenderedPageBreak/>
         <w:t>Силовая раскладка:</w:t>
       </w:r>
       <w:r>
@@ -5435,7 +5436,6 @@
                 <w:bCs/>
                 <w:color w:val="1F4E79"/>
               </w:rPr>
-              <w:lastRenderedPageBreak/>
               <w:t>Ловушка</w:t>
             </w:r>
           </w:p>
@@ -5514,7 +5514,7 @@
         <w:keepNext/>
         <w:spacing w:before="360"/>
       </w:pPr>
-      <w:bookmarkStart w:id="12" w:name="_Toc242217139"/>
+      <w:bookmarkStart w:id="12" w:name="_Toc242443282"/>
       <w:r>
         <w:t>7. Страница «Кластеры»</w:t>
       </w:r>
@@ -5525,7 +5525,7 @@
         <w:pStyle w:val="2"/>
         <w:keepNext/>
       </w:pPr>
-      <w:bookmarkStart w:id="13" w:name="_Toc242217140"/>
+      <w:bookmarkStart w:id="13" w:name="_Toc242443283"/>
       <w:r>
         <w:t>Методы</w:t>
       </w:r>
@@ -5859,7 +5859,7 @@
         <w:pStyle w:val="2"/>
         <w:keepNext/>
       </w:pPr>
-      <w:bookmarkStart w:id="14" w:name="_Toc242217141"/>
+      <w:bookmarkStart w:id="14" w:name="_Toc242443284"/>
       <w:r>
         <w:t>Режим, метод «Уорд + k-means» и номера K1…Kn</w:t>
       </w:r>
@@ -5930,7 +5930,7 @@
         <w:pStyle w:val="2"/>
         <w:keepNext/>
       </w:pPr>
-      <w:bookmarkStart w:id="15" w:name="_Toc242217142"/>
+      <w:bookmarkStart w:id="15" w:name="_Toc242443285"/>
       <w:r>
         <w:t>Как выбрать число кластеров k</w:t>
       </w:r>
@@ -5979,6 +5979,7 @@
         <w:spacing w:after="60" w:line="264" w:lineRule="auto"/>
       </w:pPr>
       <w:r>
+        <w:lastRenderedPageBreak/>
         <w:t xml:space="preserve">Ищите k, где </w:t>
       </w:r>
       <w:r>
@@ -6002,7 +6003,6 @@
         <w:spacing w:after="60" w:line="264" w:lineRule="auto"/>
       </w:pPr>
       <w:r>
-        <w:lastRenderedPageBreak/>
         <w:t>Сводная таблица по всем методам и годам — в файле reports/CLUSTERS.md: по всей России индексы чаще указывают на 4–6, локоть — на 4–5; по умолчанию k = 5 (рекомендуемый диапазон 4–6).</w:t>
       </w:r>
     </w:p>
@@ -6034,7 +6034,7 @@
         <w:pStyle w:val="2"/>
         <w:keepNext/>
       </w:pPr>
-      <w:bookmarkStart w:id="16" w:name="_Toc242217143"/>
+      <w:bookmarkStart w:id="16" w:name="_Toc242443286"/>
       <w:r>
         <w:t>На что смотреть</w:t>
       </w:r>
@@ -6125,7 +6125,7 @@
         <w:pStyle w:val="2"/>
         <w:keepNext/>
       </w:pPr>
-      <w:bookmarkStart w:id="17" w:name="_Toc242217144"/>
+      <w:bookmarkStart w:id="17" w:name="_Toc242443287"/>
       <w:r>
         <w:t>Что анализировать</w:t>
       </w:r>
@@ -6278,7 +6278,7 @@
         <w:keepNext/>
         <w:spacing w:before="360"/>
       </w:pPr>
-      <w:bookmarkStart w:id="18" w:name="_Toc242217145"/>
+      <w:bookmarkStart w:id="18" w:name="_Toc242443288"/>
       <w:r>
         <w:t>8. Страницы «Динамика» и «Конвергенция»</w:t>
       </w:r>
@@ -6289,7 +6289,7 @@
         <w:pStyle w:val="2"/>
         <w:keepNext/>
       </w:pPr>
-      <w:bookmarkStart w:id="19" w:name="_Toc242217146"/>
+      <w:bookmarkStart w:id="19" w:name="_Toc242443289"/>
       <w:r>
         <w:t>Динамика: как меняются типы</w:t>
       </w:r>
@@ -6310,7 +6310,11 @@
         <w:t>одна модель на всю панель</w:t>
       </w:r>
       <w:r>
-        <w:t xml:space="preserve"> (метод «Уорд + k-means», k = 5): типы одинаковы для всех лет, поэтому смена типа означает реальное изменение показателей МО. Режим «каждый год заново» оставлен для сравнения: в нём заметная часть переходов — шум перекластеризации.</w:t>
+        <w:t xml:space="preserve"> (метод «Уорд + k-means», k = 5): типы одинаковы для всех лет, поэтому смена типа означает реальное изменение </w:t>
+      </w:r>
+      <w:r>
+        <w:lastRenderedPageBreak/>
+        <w:t>показателей МО. Режим «каждый год заново» оставлен для сравнения: в нём заметная часть переходов — шум перекластеризации.</w:t>
       </w:r>
     </w:p>
     <w:p>
@@ -6347,7 +6351,6 @@
           <w:b/>
           <w:bCs/>
         </w:rPr>
-        <w:lastRenderedPageBreak/>
         <w:t>Устойчивость по годам:</w:t>
       </w:r>
       <w:r>
@@ -6457,7 +6460,7 @@
         <w:pStyle w:val="2"/>
         <w:keepNext/>
       </w:pPr>
-      <w:bookmarkStart w:id="20" w:name="_Toc242217147"/>
+      <w:bookmarkStart w:id="20" w:name="_Toc242443290"/>
       <w:r>
         <w:t>Конвергенция: сближаются ли МО</w:t>
       </w:r>
@@ -6865,6 +6868,7 @@
                 <w:bCs/>
                 <w:color w:val="1F4E79"/>
               </w:rPr>
+              <w:lastRenderedPageBreak/>
               <w:t>Ограничения</w:t>
             </w:r>
           </w:p>
@@ -6901,9 +6905,8 @@
         <w:keepNext/>
         <w:spacing w:before="360"/>
       </w:pPr>
-      <w:bookmarkStart w:id="21" w:name="_Toc242217148"/>
-      <w:r>
-        <w:lastRenderedPageBreak/>
+      <w:bookmarkStart w:id="21" w:name="_Toc242443291"/>
+      <w:r>
         <w:t>9. Страница «Сводные таблицы»</w:t>
       </w:r>
       <w:bookmarkEnd w:id="21"/>
@@ -6921,7 +6924,7 @@
         <w:pStyle w:val="2"/>
         <w:keepNext/>
       </w:pPr>
-      <w:bookmarkStart w:id="22" w:name="_Toc242217149"/>
+      <w:bookmarkStart w:id="22" w:name="_Toc242443292"/>
       <w:r>
         <w:t>Таблица 1. Характерные признаки кластеров</w:t>
       </w:r>
@@ -6995,7 +6998,7 @@
         <w:pStyle w:val="2"/>
         <w:keepNext/>
       </w:pPr>
-      <w:bookmarkStart w:id="23" w:name="_Toc242217150"/>
+      <w:bookmarkStart w:id="23" w:name="_Toc242443293"/>
       <w:r>
         <w:t>Таблица 2. Результаты кластеризации по периодам</w:t>
       </w:r>
@@ -7193,8 +7196,9 @@
         <w:keepNext/>
         <w:spacing w:before="360"/>
       </w:pPr>
-      <w:bookmarkStart w:id="24" w:name="_Toc242217151"/>
-      <w:r>
+      <w:bookmarkStart w:id="24" w:name="_Toc242443294"/>
+      <w:r>
+        <w:lastRenderedPageBreak/>
         <w:t>10. Страница «Обновление данных»</w:t>
       </w:r>
       <w:bookmarkEnd w:id="24"/>
@@ -7270,7 +7274,6 @@
                 <w:bCs/>
                 <w:color w:val="FFFFFF"/>
               </w:rPr>
-              <w:lastRenderedPageBreak/>
               <w:t>Режим</w:t>
             </w:r>
           </w:p>
@@ -7550,7 +7553,7 @@
         <w:keepNext/>
         <w:spacing w:before="360"/>
       </w:pPr>
-      <w:bookmarkStart w:id="25" w:name="_Toc242217152"/>
+      <w:bookmarkStart w:id="25" w:name="_Toc242443295"/>
       <w:r>
         <w:t>11. Шпаргалка по индексам качества</w:t>
       </w:r>
@@ -8324,6 +8327,7 @@
               <w:spacing w:after="40" w:line="252" w:lineRule="auto"/>
             </w:pPr>
             <w:r>
+              <w:lastRenderedPageBreak/>
               <w:t>MQ (модулярность)</w:t>
             </w:r>
           </w:p>
@@ -8513,7 +8517,7 @@
         <w:keepNext/>
         <w:spacing w:before="360"/>
       </w:pPr>
-      <w:bookmarkStart w:id="26" w:name="_Toc242217153"/>
+      <w:bookmarkStart w:id="26" w:name="_Toc242443296"/>
       <w:r>
         <w:t>12. Проверка вывода перед тем, как вносить его в отчёт</w:t>
       </w:r>
@@ -8696,7 +8700,7 @@
         <w:t>Формулировка:</w:t>
       </w:r>
       <w:r>
-        <w:t xml:space="preserve"> «оценка ВМП», «по данным Росстата без малого бизнеса», «в ценах 2023 г.», «на окне 2013–2024».</w:t>
+        <w:t xml:space="preserve"> «оценка ВМП», «по данным Росстата без малого бизнеса», «в ценах 2020 г.», «на окне 2014–2024».</w:t>
       </w:r>
     </w:p>
     <w:p>
@@ -8705,7 +8709,7 @@
         <w:keepNext/>
         <w:spacing w:before="360"/>
       </w:pPr>
-      <w:bookmarkStart w:id="27" w:name="_Toc242217154"/>
+      <w:bookmarkStart w:id="27" w:name="_Toc242443297"/>
       <w:r>
         <w:t>13. Какие исследовательские вопросы можно поставить</w:t>
       </w:r>
@@ -8988,6 +8992,7 @@
               <w:spacing w:after="40" w:line="252" w:lineRule="auto"/>
             </w:pPr>
             <w:r>
+              <w:lastRenderedPageBreak/>
               <w:t>Совпадают ли типы с регионами?</w:t>
             </w:r>
           </w:p>
@@ -9192,7 +9197,6 @@
               <w:spacing w:after="40" w:line="252" w:lineRule="auto"/>
             </w:pPr>
             <w:r>
-              <w:lastRenderedPageBreak/>
               <w:t>Устойчива ли типология во времени, были ли переломные годы?</w:t>
             </w:r>
           </w:p>
@@ -9583,7 +9587,7 @@
         <w:keepNext/>
         <w:spacing w:before="360"/>
       </w:pPr>
-      <w:bookmarkStart w:id="28" w:name="_Toc242217155"/>
+      <w:bookmarkStart w:id="28" w:name="_Toc242443298"/>
       <w:r>
         <w:t>14. Ограничения данных: что нельзя утверждать</w:t>
       </w:r>
@@ -9723,6 +9727,7 @@
           <w:b/>
           <w:bCs/>
         </w:rPr>
+        <w:lastRenderedPageBreak/>
         <w:t>Разрывы рядов:</w:t>
       </w:r>
       <w:r>
@@ -9755,9 +9760,8 @@
         <w:keepNext/>
         <w:spacing w:before="360"/>
       </w:pPr>
-      <w:bookmarkStart w:id="29" w:name="_Toc242217156"/>
-      <w:r>
-        <w:lastRenderedPageBreak/>
+      <w:bookmarkStart w:id="29" w:name="_Toc242443299"/>
+      <w:r>
         <w:t>15. Где что лежит</w:t>
       </w:r>
       <w:bookmarkEnd w:id="29"/>
@@ -10389,7 +10393,7 @@
         <w:pStyle w:val="2"/>
         <w:keepNext/>
       </w:pPr>
-      <w:bookmarkStart w:id="30" w:name="_Toc242217157"/>
+      <w:bookmarkStart w:id="30" w:name="_Toc242443300"/>
       <w:r>
         <w:t>Глоссарий</w:t>
       </w:r>
@@ -10943,6 +10947,7 @@
               <w:spacing w:after="40" w:line="252" w:lineRule="auto"/>
             </w:pPr>
             <w:r>
+              <w:lastRenderedPageBreak/>
               <w:t>σ- и β-конвергенция</w:t>
             </w:r>
           </w:p>
@@ -11041,7 +11046,6 @@
               <w:spacing w:after="40" w:line="252" w:lineRule="auto"/>
             </w:pPr>
             <w:r>
-              <w:lastRenderedPageBreak/>
               <w:t>pooled</w:t>
             </w:r>
           </w:p>
@@ -11220,241 +11224,241 @@
 <file path=word/numbering.xml><?xml version="1.0" encoding="utf-8"?>
 <w:numbering xmlns:wpc="http://schemas.microsoft.com/office/word/2010/wordprocessingCanvas" xmlns:cx="http://schemas.microsoft.com/office/drawing/2014/chartex" xmlns:cx1="http://schemas.microsoft.com/office/drawing/2015/9/8/chartex" xmlns:cx2="http://schemas.microsoft.com/office/drawing/2015/10/21/chartex" xmlns:cx3="http://schemas.microsoft.com/office/drawing/2016/5/9/chartex" xmlns:cx4="http://schemas.microsoft.com/office/drawing/2016/5/10/chartex" xmlns:cx5="http://schemas.microsoft.com/office/drawing/2016/5/11/chartex" xmlns:cx6="http://schemas.microsoft.com/office/drawing/2016/5/12/chartex" xmlns:cx7="http://schemas.microsoft.com/office/drawing/2016/5/13/chartex" xmlns:cx8="http://schemas.microsoft.com/office/drawing/2016/5/14/chartex" xmlns:mc="http://schemas.openxmlformats.org/markup-compatibility/2006" xmlns:aink="http://schemas.microsoft.com/office/drawing/2016/ink" xmlns:am3d="http://schemas.microsoft.com/office/drawing/2017/model3d" xmlns:o="urn:schemas-microsoft-com:office:office" xmlns:oel="http://schemas.microsoft.com/office/2019/extlst" xmlns:r="http://schemas.openxmlformats.org/officeDocument/2006/relationships" xmlns:m="http://schemas.openxmlformats.org/officeDocument/2006/math" xmlns:v="urn:schemas-microsoft-com:vml" xmlns:wp14="http://schemas.microsoft.com/office/word/2010/wordprocessingDrawing" xmlns:wp="http://schemas.openxmlformats.org/drawingml/2006/wordprocessingDrawing" xmlns:w10="urn:schemas-microsoft-com:office:word" xmlns:w="http://schemas.openxmlformats.org/wordprocessingml/2006/main" xmlns:w14="http://schemas.microsoft.com/office/word/2010/wordml" xmlns:w15="http://schemas.microsoft.com/office/word/2012/wordml" xmlns:w16cex="http://schemas.microsoft.com/office/word/2018/wordml/cex" xmlns:w16cid="http://schemas.microsoft.com/office/word/2016/wordml/cid" xmlns:w16="http://schemas.microsoft.com/office/word/2018/wordml" xmlns:w16du="http://schemas.microsoft.com/office/word/2023/wordml/word16du" xmlns:w16sdtdh="http://schemas.microsoft.com/office/word/2020/wordml/sdtdatahash" xmlns:w16sdtfl="http://schemas.microsoft.com/office/word/2024/wordml/sdtformatlock" xmlns:w16se="http://schemas.microsoft.com/office/word/2015/wordml/symex" xmlns:wpg="http://schemas.microsoft.com/office/word/2010/wordprocessingGroup" xmlns:wpi="http://schemas.microsoft.com/office/word/2010/wordprocessingInk" xmlns:wne="http://schemas.microsoft.com/office/word/2006/wordml" xmlns:wps="http://schemas.microsoft.com/office/word/2010/wordprocessingShape" mc:Ignorable="w14 w15 w16se w16cid w16 w16cex w16sdtdh w16sdtfl w16du wp14">
   <w:abstractNum w:abstractNumId="0" w15:restartNumberingAfterBreak="0">
-    <w:nsid w:val="304C0B9B"/>
+    <w:nsid w:val="38EA2E19"/>
     <w:multiLevelType w:val="hybridMultilevel"/>
-    <w:tmpl w:val="D366A4EA"/>
-    <w:lvl w:ilvl="0" w:tplc="466E370C">
+    <w:tmpl w:val="463E1300"/>
+    <w:lvl w:ilvl="0" w:tplc="443ACB00" w:tentative="1">
       <w:start w:val="1"/>
       <w:numFmt w:val="bullet"/>
-      <w:lvlText w:val="•"/>
+      <w:lvlText w:val="●"/>
       <w:lvlJc w:val="left"/>
       <w:pPr>
-        <w:ind w:left="540" w:hanging="270"/>
+        <w:ind w:left="720" w:hanging="360"/>
       </w:pPr>
     </w:lvl>
-    <w:lvl w:ilvl="1" w:tplc="2B58448C" w:tentative="1">
+    <w:lvl w:ilvl="1" w:tplc="41FE4092" w:tentative="1">
       <w:start w:val="1"/>
       <w:numFmt w:val="bullet"/>
-      <w:lvlText w:val="–"/>
+      <w:lvlText w:val="○"/>
       <w:lvlJc w:val="left"/>
       <w:pPr>
-        <w:ind w:left="1080" w:hanging="270"/>
+        <w:ind w:left="1440" w:hanging="360"/>
       </w:pPr>
     </w:lvl>
-    <w:lvl w:ilvl="2" w:tplc="17EE6BD6">
+    <w:lvl w:ilvl="2" w:tplc="6BE25C8A" w:tentative="1">
+      <w:start w:val="1"/>
+      <w:numFmt w:val="bullet"/>
+      <w:lvlText w:val="■"/>
+      <w:lvlJc w:val="left"/>
+      <w:pPr>
+        <w:ind w:left="2160" w:hanging="360"/>
+      </w:pPr>
+    </w:lvl>
+    <w:lvl w:ilvl="3" w:tplc="74BA658E" w:tentative="1">
+      <w:start w:val="1"/>
+      <w:numFmt w:val="bullet"/>
+      <w:lvlText w:val="●"/>
+      <w:lvlJc w:val="left"/>
+      <w:pPr>
+        <w:ind w:left="2880" w:hanging="360"/>
+      </w:pPr>
+    </w:lvl>
+    <w:lvl w:ilvl="4" w:tplc="7B8400F8" w:tentative="1">
+      <w:start w:val="1"/>
+      <w:numFmt w:val="bullet"/>
+      <w:lvlText w:val="○"/>
+      <w:lvlJc w:val="left"/>
+      <w:pPr>
+        <w:ind w:left="3600" w:hanging="360"/>
+      </w:pPr>
+    </w:lvl>
+    <w:lvl w:ilvl="5" w:tplc="8968C25E" w:tentative="1">
+      <w:start w:val="1"/>
+      <w:numFmt w:val="bullet"/>
+      <w:lvlText w:val="■"/>
+      <w:lvlJc w:val="left"/>
+      <w:pPr>
+        <w:ind w:left="4320" w:hanging="360"/>
+      </w:pPr>
+    </w:lvl>
+    <w:lvl w:ilvl="6" w:tplc="09542A1E" w:tentative="1">
+      <w:start w:val="1"/>
+      <w:numFmt w:val="bullet"/>
+      <w:lvlText w:val="●"/>
+      <w:lvlJc w:val="left"/>
+      <w:pPr>
+        <w:ind w:left="5040" w:hanging="360"/>
+      </w:pPr>
+    </w:lvl>
+    <w:lvl w:ilvl="7" w:tplc="0D524396" w:tentative="1">
+      <w:start w:val="1"/>
+      <w:numFmt w:val="bullet"/>
+      <w:lvlText w:val="●"/>
+      <w:lvlJc w:val="left"/>
+      <w:pPr>
+        <w:ind w:left="5760" w:hanging="360"/>
+      </w:pPr>
+    </w:lvl>
+    <w:lvl w:ilvl="8" w:tplc="33FC9208" w:tentative="1">
+      <w:start w:val="1"/>
+      <w:numFmt w:val="bullet"/>
+      <w:lvlText w:val="●"/>
+      <w:lvlJc w:val="left"/>
+      <w:pPr>
+        <w:ind w:left="6480" w:hanging="360"/>
+      </w:pPr>
+    </w:lvl>
+  </w:abstractNum>
+  <w:abstractNum w:abstractNumId="1" w15:restartNumberingAfterBreak="0">
+    <w:nsid w:val="568D3719"/>
+    <w:multiLevelType w:val="hybridMultilevel"/>
+    <w:tmpl w:val="FDB2496C"/>
+    <w:lvl w:ilvl="0" w:tplc="07A8FB2E">
+      <w:start w:val="1"/>
+      <w:numFmt w:val="decimal"/>
+      <w:lvlText w:val="%1."/>
+      <w:lvlJc w:val="left"/>
+      <w:pPr>
+        <w:ind w:left="540" w:hanging="300"/>
+      </w:pPr>
+    </w:lvl>
+    <w:lvl w:ilvl="1" w:tplc="C9123782">
       <w:numFmt w:val="decimal"/>
       <w:lvlText w:val=""/>
       <w:lvlJc w:val="left"/>
     </w:lvl>
-    <w:lvl w:ilvl="3" w:tplc="7DCA4C94">
+    <w:lvl w:ilvl="2" w:tplc="F640BE32">
       <w:numFmt w:val="decimal"/>
       <w:lvlText w:val=""/>
       <w:lvlJc w:val="left"/>
     </w:lvl>
-    <w:lvl w:ilvl="4" w:tplc="20085D98">
+    <w:lvl w:ilvl="3" w:tplc="F8EC16E8">
       <w:numFmt w:val="decimal"/>
       <w:lvlText w:val=""/>
       <w:lvlJc w:val="left"/>
     </w:lvl>
-    <w:lvl w:ilvl="5" w:tplc="29142706">
+    <w:lvl w:ilvl="4" w:tplc="0966F166">
       <w:numFmt w:val="decimal"/>
       <w:lvlText w:val=""/>
       <w:lvlJc w:val="left"/>
     </w:lvl>
-    <w:lvl w:ilvl="6" w:tplc="5C18806A">
+    <w:lvl w:ilvl="5" w:tplc="75D01264">
       <w:numFmt w:val="decimal"/>
       <w:lvlText w:val=""/>
       <w:lvlJc w:val="left"/>
     </w:lvl>
-    <w:lvl w:ilvl="7" w:tplc="E4FE8230">
+    <w:lvl w:ilvl="6" w:tplc="03B0B8E2">
       <w:numFmt w:val="decimal"/>
       <w:lvlText w:val=""/>
       <w:lvlJc w:val="left"/>
     </w:lvl>
-    <w:lvl w:ilvl="8" w:tplc="EC0C211C">
+    <w:lvl w:ilvl="7" w:tplc="58FE6914">
+      <w:numFmt w:val="decimal"/>
+      <w:lvlText w:val=""/>
+      <w:lvlJc w:val="left"/>
+    </w:lvl>
+    <w:lvl w:ilvl="8" w:tplc="9E0CC298">
       <w:numFmt w:val="decimal"/>
       <w:lvlText w:val=""/>
       <w:lvlJc w:val="left"/>
     </w:lvl>
   </w:abstractNum>
-  <w:abstractNum w:abstractNumId="1" w15:restartNumberingAfterBreak="0">
-    <w:nsid w:val="4D0A4F29"/>
+  <w:abstractNum w:abstractNumId="2" w15:restartNumberingAfterBreak="0">
+    <w:nsid w:val="6421245D"/>
     <w:multiLevelType w:val="hybridMultilevel"/>
-    <w:tmpl w:val="3668882C"/>
-    <w:lvl w:ilvl="0" w:tplc="A45E28FC" w:tentative="1">
+    <w:tmpl w:val="67CA1748"/>
+    <w:lvl w:ilvl="0" w:tplc="9894E22E">
       <w:start w:val="1"/>
       <w:numFmt w:val="bullet"/>
-      <w:lvlText w:val="●"/>
+      <w:lvlText w:val="•"/>
       <w:lvlJc w:val="left"/>
       <w:pPr>
-        <w:ind w:left="720" w:hanging="360"/>
+        <w:ind w:left="540" w:hanging="270"/>
       </w:pPr>
     </w:lvl>
-    <w:lvl w:ilvl="1" w:tplc="CAA82180" w:tentative="1">
+    <w:lvl w:ilvl="1" w:tplc="AD2AA30E" w:tentative="1">
       <w:start w:val="1"/>
       <w:numFmt w:val="bullet"/>
-      <w:lvlText w:val="○"/>
+      <w:lvlText w:val="–"/>
       <w:lvlJc w:val="left"/>
       <w:pPr>
-        <w:ind w:left="1440" w:hanging="360"/>
+        <w:ind w:left="1080" w:hanging="270"/>
       </w:pPr>
     </w:lvl>
-    <w:lvl w:ilvl="2" w:tplc="AD10E5E2" w:tentative="1">
-      <w:start w:val="1"/>
-      <w:numFmt w:val="bullet"/>
-      <w:lvlText w:val="■"/>
-      <w:lvlJc w:val="left"/>
-      <w:pPr>
-        <w:ind w:left="2160" w:hanging="360"/>
-      </w:pPr>
-    </w:lvl>
-    <w:lvl w:ilvl="3" w:tplc="A9860CE6" w:tentative="1">
-      <w:start w:val="1"/>
-      <w:numFmt w:val="bullet"/>
-      <w:lvlText w:val="●"/>
-      <w:lvlJc w:val="left"/>
-      <w:pPr>
-        <w:ind w:left="2880" w:hanging="360"/>
-      </w:pPr>
-    </w:lvl>
-    <w:lvl w:ilvl="4" w:tplc="275E8EBE" w:tentative="1">
-      <w:start w:val="1"/>
-      <w:numFmt w:val="bullet"/>
-      <w:lvlText w:val="○"/>
-      <w:lvlJc w:val="left"/>
-      <w:pPr>
-        <w:ind w:left="3600" w:hanging="360"/>
-      </w:pPr>
-    </w:lvl>
-    <w:lvl w:ilvl="5" w:tplc="A4F28BC6" w:tentative="1">
-      <w:start w:val="1"/>
-      <w:numFmt w:val="bullet"/>
-      <w:lvlText w:val="■"/>
-      <w:lvlJc w:val="left"/>
-      <w:pPr>
-        <w:ind w:left="4320" w:hanging="360"/>
-      </w:pPr>
-    </w:lvl>
-    <w:lvl w:ilvl="6" w:tplc="C6C61B04" w:tentative="1">
-      <w:start w:val="1"/>
-      <w:numFmt w:val="bullet"/>
-      <w:lvlText w:val="●"/>
-      <w:lvlJc w:val="left"/>
-      <w:pPr>
-        <w:ind w:left="5040" w:hanging="360"/>
-      </w:pPr>
-    </w:lvl>
-    <w:lvl w:ilvl="7" w:tplc="E4AA04F0" w:tentative="1">
-      <w:start w:val="1"/>
-      <w:numFmt w:val="bullet"/>
-      <w:lvlText w:val="●"/>
-      <w:lvlJc w:val="left"/>
-      <w:pPr>
-        <w:ind w:left="5760" w:hanging="360"/>
-      </w:pPr>
-    </w:lvl>
-    <w:lvl w:ilvl="8" w:tplc="EE2A6998" w:tentative="1">
-      <w:start w:val="1"/>
-      <w:numFmt w:val="bullet"/>
-      <w:lvlText w:val="●"/>
-      <w:lvlJc w:val="left"/>
-      <w:pPr>
-        <w:ind w:left="6480" w:hanging="360"/>
-      </w:pPr>
-    </w:lvl>
-  </w:abstractNum>
-  <w:abstractNum w:abstractNumId="2" w15:restartNumberingAfterBreak="0">
-    <w:nsid w:val="796D2775"/>
-    <w:multiLevelType w:val="hybridMultilevel"/>
-    <w:tmpl w:val="C7440D96"/>
-    <w:lvl w:ilvl="0" w:tplc="95E4BB56">
-      <w:start w:val="1"/>
-      <w:numFmt w:val="decimal"/>
-      <w:lvlText w:val="%1."/>
-      <w:lvlJc w:val="left"/>
-      <w:pPr>
-        <w:ind w:left="540" w:hanging="300"/>
-      </w:pPr>
-    </w:lvl>
-    <w:lvl w:ilvl="1" w:tplc="62B656C4">
+    <w:lvl w:ilvl="2" w:tplc="B7AE400E">
       <w:numFmt w:val="decimal"/>
       <w:lvlText w:val=""/>
       <w:lvlJc w:val="left"/>
     </w:lvl>
-    <w:lvl w:ilvl="2" w:tplc="FF420F9A">
+    <w:lvl w:ilvl="3" w:tplc="CA8C0516">
       <w:numFmt w:val="decimal"/>
       <w:lvlText w:val=""/>
       <w:lvlJc w:val="left"/>
     </w:lvl>
-    <w:lvl w:ilvl="3" w:tplc="0E1EEF7A">
+    <w:lvl w:ilvl="4" w:tplc="91167280">
       <w:numFmt w:val="decimal"/>
       <w:lvlText w:val=""/>
       <w:lvlJc w:val="left"/>
     </w:lvl>
-    <w:lvl w:ilvl="4" w:tplc="CF242D1E">
+    <w:lvl w:ilvl="5" w:tplc="17603B2C">
       <w:numFmt w:val="decimal"/>
       <w:lvlText w:val=""/>
       <w:lvlJc w:val="left"/>
     </w:lvl>
-    <w:lvl w:ilvl="5" w:tplc="5B8A58C2">
+    <w:lvl w:ilvl="6" w:tplc="5914B960">
       <w:numFmt w:val="decimal"/>
       <w:lvlText w:val=""/>
       <w:lvlJc w:val="left"/>
     </w:lvl>
-    <w:lvl w:ilvl="6" w:tplc="9CACE0BC">
+    <w:lvl w:ilvl="7" w:tplc="1F9C1A08">
       <w:numFmt w:val="decimal"/>
       <w:lvlText w:val=""/>
       <w:lvlJc w:val="left"/>
     </w:lvl>
-    <w:lvl w:ilvl="7" w:tplc="3104CE1E">
-      <w:numFmt w:val="decimal"/>
-      <w:lvlText w:val=""/>
-      <w:lvlJc w:val="left"/>
-    </w:lvl>
-    <w:lvl w:ilvl="8" w:tplc="D81C3990">
+    <w:lvl w:ilvl="8" w:tplc="13F4B8E4">
       <w:numFmt w:val="decimal"/>
       <w:lvlText w:val=""/>
       <w:lvlJc w:val="left"/>
     </w:lvl>
   </w:abstractNum>
-  <w:num w:numId="1" w16cid:durableId="196502969">
+  <w:num w:numId="1" w16cid:durableId="1409496382">
+    <w:abstractNumId w:val="0"/>
+    <w:lvlOverride w:ilvl="0">
+      <w:startOverride w:val="1"/>
+    </w:lvlOverride>
+  </w:num>
+  <w:num w:numId="2" w16cid:durableId="1180969514">
+    <w:abstractNumId w:val="2"/>
+    <w:lvlOverride w:ilvl="0">
+      <w:startOverride w:val="1"/>
+    </w:lvlOverride>
+  </w:num>
+  <w:num w:numId="3" w16cid:durableId="1722093681">
     <w:abstractNumId w:val="1"/>
     <w:lvlOverride w:ilvl="0">
       <w:startOverride w:val="1"/>
     </w:lvlOverride>
   </w:num>
-  <w:num w:numId="2" w16cid:durableId="243612006">
-    <w:abstractNumId w:val="0"/>
+  <w:num w:numId="4" w16cid:durableId="585575872">
+    <w:abstractNumId w:val="1"/>
     <w:lvlOverride w:ilvl="0">
       <w:startOverride w:val="1"/>
     </w:lvlOverride>
   </w:num>
-  <w:num w:numId="3" w16cid:durableId="406730971">
-    <w:abstractNumId w:val="2"/>
+  <w:num w:numId="5" w16cid:durableId="1814055607">
+    <w:abstractNumId w:val="1"/>
     <w:lvlOverride w:ilvl="0">
       <w:startOverride w:val="1"/>
     </w:lvlOverride>
   </w:num>
-  <w:num w:numId="4" w16cid:durableId="602767138">
-    <w:abstractNumId w:val="2"/>
+  <w:num w:numId="6" w16cid:durableId="2045591792">
+    <w:abstractNumId w:val="1"/>
     <w:lvlOverride w:ilvl="0">
       <w:startOverride w:val="1"/>
     </w:lvlOverride>
   </w:num>
-  <w:num w:numId="5" w16cid:durableId="1650355377">
-    <w:abstractNumId w:val="2"/>
-    <w:lvlOverride w:ilvl="0">
-      <w:startOverride w:val="1"/>
-    </w:lvlOverride>
-  </w:num>
-  <w:num w:numId="6" w16cid:durableId="658505773">
-    <w:abstractNumId w:val="2"/>
-    <w:lvlOverride w:ilvl="0">
-      <w:startOverride w:val="1"/>
-    </w:lvlOverride>
-  </w:num>
-  <w:num w:numId="7" w16cid:durableId="856384472">
-    <w:abstractNumId w:val="2"/>
+  <w:num w:numId="7" w16cid:durableId="679313314">
+    <w:abstractNumId w:val="1"/>
     <w:lvlOverride w:ilvl="0">
       <w:startOverride w:val="1"/>
     </w:lvlOverride>
@@ -12093,7 +12097,7 @@
     <w:autoRedefine/>
     <w:uiPriority w:val="39"/>
     <w:unhideWhenUsed/>
-    <w:rsid w:val="007D692A"/>
+    <w:rsid w:val="00974D79"/>
     <w:pPr>
       <w:spacing w:after="100"/>
     </w:pPr>
@@ -12105,7 +12109,7 @@
     <w:autoRedefine/>
     <w:uiPriority w:val="39"/>
     <w:unhideWhenUsed/>
-    <w:rsid w:val="007D692A"/>
+    <w:rsid w:val="00974D79"/>
     <w:pPr>
       <w:spacing w:after="100"/>
       <w:ind w:left="220"/>

</xml_diff>